<commit_message>
Update estimate template with payment address, T&C review notice, and fix section numbering
Adds payment mailing address under Payment Terms, a paragraph directing
clients to review the terms and conditions, and consolidates the duplicate
section 7s into a single section 8 (Permits and Code Compliance + right to
suspend work). Also expands CLAUDE.md with detailed project documentation.

Co-Authored-By: Claude Opus 4.6 <noreply@anthropic.com>
</commit_message>
<xml_diff>
--- a/Estimate Template.docx
+++ b/Estimate Template.docx
@@ -583,7 +583,15 @@
                 <w:b/>
                 <w:bCs/>
               </w:rPr>
-              <w:t xml:space="preserve">Project Name: </w:t>
+              <w:t xml:space="preserve">Project </w:t>
+            </w:r>
+            <w:proofErr w:type="gramStart"/>
+            <w:r>
+              <w:rPr>
+                <w:b/>
+                <w:bCs/>
+              </w:rPr>
+              <w:t xml:space="preserve">Name: </w:t>
             </w:r>
             <w:r>
               <w:rPr>
@@ -600,6 +608,7 @@
               <w:t>{</w:t>
             </w:r>
             <w:proofErr w:type="spellStart"/>
+            <w:proofErr w:type="gramEnd"/>
             <w:r>
               <w:rPr>
                 <w:b/>
@@ -681,11 +690,16 @@
         <w:t>#sections</w:t>
       </w:r>
       <w:r>
-        <w:t xml:space="preserve"> in sections %</w:t>
+        <w:t xml:space="preserve"> in </w:t>
+      </w:r>
+      <w:proofErr w:type="gramStart"/>
+      <w:r>
+        <w:t>sections %</w:t>
       </w:r>
       <w:r>
         <w:t>}</w:t>
       </w:r>
+      <w:proofErr w:type="gramEnd"/>
     </w:p>
     <w:tbl>
       <w:tblPr>
@@ -812,6 +826,7 @@
               <w:t>{{</w:t>
             </w:r>
             <w:proofErr w:type="spellStart"/>
+            <w:proofErr w:type="gramStart"/>
             <w:r>
               <w:rPr>
                 <w:b/>
@@ -833,6 +848,7 @@
               <w:t>title</w:t>
             </w:r>
             <w:proofErr w:type="spellEnd"/>
+            <w:proofErr w:type="gramEnd"/>
             <w:r>
               <w:rPr>
                 <w:b/>
@@ -895,6 +911,7 @@
               <w:t>{{</w:t>
             </w:r>
             <w:proofErr w:type="spellStart"/>
+            <w:proofErr w:type="gramStart"/>
             <w:r>
               <w:rPr>
                 <w:b/>
@@ -916,6 +933,7 @@
               <w:t>price</w:t>
             </w:r>
             <w:proofErr w:type="spellEnd"/>
+            <w:proofErr w:type="gramEnd"/>
             <w:r>
               <w:rPr>
                 <w:b/>
@@ -962,6 +980,7 @@
         <w:t xml:space="preserve">% for line in </w:t>
       </w:r>
       <w:proofErr w:type="spellStart"/>
+      <w:proofErr w:type="gramStart"/>
       <w:r>
         <w:rPr>
           <w:color w:val="4A4A4A"/>
@@ -979,6 +998,7 @@
         <w:t>lines</w:t>
       </w:r>
       <w:proofErr w:type="spellEnd"/>
+      <w:proofErr w:type="gramEnd"/>
       <w:r>
         <w:rPr>
           <w:color w:val="4A4A4A"/>
@@ -1023,6 +1043,7 @@
         <w:t>{</w:t>
       </w:r>
       <w:proofErr w:type="spellStart"/>
+      <w:proofErr w:type="gramStart"/>
       <w:r>
         <w:rPr>
           <w:color w:val="4A4A4A"/>
@@ -1032,6 +1053,7 @@
         <w:t>line.lineNum</w:t>
       </w:r>
       <w:proofErr w:type="spellEnd"/>
+      <w:proofErr w:type="gramEnd"/>
       <w:r>
         <w:rPr>
           <w:color w:val="4A4A4A"/>
@@ -1133,15 +1155,16 @@
           <w:sz w:val="21"/>
           <w:szCs w:val="21"/>
         </w:rPr>
-        <w:t xml:space="preserve"> %</w:t>
-      </w:r>
+        <w:t xml:space="preserve"> </w:t>
+      </w:r>
+      <w:proofErr w:type="gramStart"/>
       <w:r>
         <w:rPr>
           <w:color w:val="4A4A4A"/>
           <w:sz w:val="21"/>
           <w:szCs w:val="21"/>
         </w:rPr>
-        <w:t xml:space="preserve"> </w:t>
+        <w:t>%</w:t>
       </w:r>
       <w:r>
         <w:rPr>
@@ -1149,19 +1172,17 @@
           <w:sz w:val="21"/>
           <w:szCs w:val="21"/>
         </w:rPr>
-        <w:t>}</w:t>
-      </w:r>
-    </w:p>
-    <w:p>
-      <w:pPr>
-        <w:spacing w:before="60" w:after="60"/>
-        <w:ind w:left="400"/>
+        <w:t xml:space="preserve"> </w:t>
+      </w:r>
+      <w:r>
         <w:rPr>
           <w:color w:val="4A4A4A"/>
           <w:sz w:val="21"/>
           <w:szCs w:val="21"/>
         </w:rPr>
-      </w:pPr>
+        <w:t>}</w:t>
+      </w:r>
+      <w:proofErr w:type="gramEnd"/>
     </w:p>
     <w:p>
       <w:pPr>
@@ -1184,49 +1205,70 @@
           <w:szCs w:val="21"/>
         </w:rPr>
       </w:pPr>
-      <w:r>
+    </w:p>
+    <w:p>
+      <w:pPr>
+        <w:spacing w:before="60" w:after="60"/>
+        <w:ind w:left="400"/>
         <w:rPr>
           <w:color w:val="4A4A4A"/>
           <w:sz w:val="21"/>
           <w:szCs w:val="21"/>
         </w:rPr>
-        <w:lastRenderedPageBreak/>
-        <w:t>{</w:t>
-      </w:r>
+      </w:pPr>
       <w:r>
         <w:rPr>
           <w:color w:val="4A4A4A"/>
           <w:sz w:val="21"/>
           <w:szCs w:val="21"/>
         </w:rPr>
-        <w:t xml:space="preserve">% </w:t>
-      </w:r>
-      <w:proofErr w:type="spellStart"/>
+        <w:lastRenderedPageBreak/>
+        <w:t>{</w:t>
+      </w:r>
       <w:r>
         <w:rPr>
           <w:color w:val="4A4A4A"/>
           <w:sz w:val="21"/>
           <w:szCs w:val="21"/>
         </w:rPr>
-        <w:t>endfor</w:t>
-      </w:r>
-      <w:proofErr w:type="spellEnd"/>
+        <w:t xml:space="preserve">% </w:t>
+      </w:r>
+      <w:proofErr w:type="spellStart"/>
       <w:r>
         <w:rPr>
           <w:color w:val="4A4A4A"/>
           <w:sz w:val="21"/>
           <w:szCs w:val="21"/>
         </w:rPr>
-        <w:t xml:space="preserve"> %</w:t>
-      </w:r>
+        <w:t>endfor</w:t>
+      </w:r>
+      <w:proofErr w:type="spellEnd"/>
       <w:r>
         <w:rPr>
           <w:color w:val="4A4A4A"/>
           <w:sz w:val="21"/>
           <w:szCs w:val="21"/>
         </w:rPr>
+        <w:t xml:space="preserve"> </w:t>
+      </w:r>
+      <w:proofErr w:type="gramStart"/>
+      <w:r>
+        <w:rPr>
+          <w:color w:val="4A4A4A"/>
+          <w:sz w:val="21"/>
+          <w:szCs w:val="21"/>
+        </w:rPr>
+        <w:t>%</w:t>
+      </w:r>
+      <w:r>
+        <w:rPr>
+          <w:color w:val="4A4A4A"/>
+          <w:sz w:val="21"/>
+          <w:szCs w:val="21"/>
+        </w:rPr>
         <w:t xml:space="preserve"> }</w:t>
       </w:r>
+      <w:proofErr w:type="gramEnd"/>
     </w:p>
     <w:tbl>
       <w:tblPr>
@@ -1372,6 +1414,39 @@
       <w:proofErr w:type="spellEnd"/>
       <w:r>
         <w:t>}}</w:t>
+      </w:r>
+    </w:p>
+    <w:p>
+      <w:pPr>
+        <w:tabs>
+          <w:tab w:val="left" w:pos="270"/>
+          <w:tab w:val="left" w:pos="450"/>
+        </w:tabs>
+        <w:spacing w:before="100" w:after="100"/>
+      </w:pPr>
+    </w:p>
+    <w:p>
+      <w:pPr>
+        <w:tabs>
+          <w:tab w:val="left" w:pos="270"/>
+          <w:tab w:val="left" w:pos="450"/>
+        </w:tabs>
+        <w:spacing w:before="100" w:after="100"/>
+      </w:pPr>
+      <w:r>
+        <w:t xml:space="preserve">Please take a moment to carefully review and familiarize yourself with the terms and conditions outlined on the last page of this estimate, as they form an important part of the agreement. </w:t>
+      </w:r>
+    </w:p>
+    <w:p>
+      <w:pPr>
+        <w:tabs>
+          <w:tab w:val="left" w:pos="270"/>
+          <w:tab w:val="left" w:pos="450"/>
+        </w:tabs>
+        <w:spacing w:before="100" w:after="100"/>
+      </w:pPr>
+      <w:r>
+        <w:t>If you have any questions or need clarification on any items, feel free to reach out before proceeding.</w:t>
       </w:r>
     </w:p>
     <w:p>
@@ -1721,54 +1796,6 @@
     </w:p>
     <w:p>
       <w:pPr>
-        <w:tabs>
-          <w:tab w:val="left" w:pos="270"/>
-          <w:tab w:val="left" w:pos="450"/>
-        </w:tabs>
-      </w:pPr>
-    </w:p>
-    <w:p>
-      <w:pPr>
-        <w:tabs>
-          <w:tab w:val="left" w:pos="270"/>
-          <w:tab w:val="left" w:pos="450"/>
-        </w:tabs>
-      </w:pPr>
-    </w:p>
-    <w:p>
-      <w:pPr>
-        <w:tabs>
-          <w:tab w:val="left" w:pos="270"/>
-          <w:tab w:val="left" w:pos="450"/>
-        </w:tabs>
-      </w:pPr>
-    </w:p>
-    <w:p>
-      <w:pPr>
-        <w:tabs>
-          <w:tab w:val="left" w:pos="270"/>
-          <w:tab w:val="left" w:pos="450"/>
-        </w:tabs>
-      </w:pPr>
-    </w:p>
-    <w:p>
-      <w:pPr>
-        <w:tabs>
-          <w:tab w:val="left" w:pos="270"/>
-          <w:tab w:val="left" w:pos="450"/>
-        </w:tabs>
-      </w:pPr>
-    </w:p>
-    <w:p>
-      <w:pPr>
-        <w:tabs>
-          <w:tab w:val="left" w:pos="270"/>
-          <w:tab w:val="left" w:pos="450"/>
-        </w:tabs>
-      </w:pPr>
-    </w:p>
-    <w:p>
-      <w:pPr>
         <w:pBdr>
           <w:bottom w:val="single" w:sz="6" w:space="4" w:color="E05A00"/>
         </w:pBdr>
@@ -1841,17 +1868,104 @@
     <w:p>
       <w:pPr>
         <w:spacing w:before="100" w:after="100"/>
-      </w:pPr>
+        <w:rPr>
+          <w:color w:val="666666"/>
+        </w:rPr>
+      </w:pPr>
+      <w:r>
+        <w:rPr>
+          <w:color w:val="666666"/>
+        </w:rPr>
+        <w:t xml:space="preserve">Unless otherwise agreed all payments should be made to address below: </w:t>
+      </w:r>
+    </w:p>
+    <w:p>
+      <w:pPr>
+        <w:spacing w:before="100"/>
+        <w:rPr>
+          <w:color w:val="666666"/>
+        </w:rPr>
+      </w:pPr>
+      <w:r>
+        <w:rPr>
+          <w:color w:val="666666"/>
+        </w:rPr>
+        <w:t>KG Construction Corp</w:t>
+      </w:r>
+      <w:r>
+        <w:rPr>
+          <w:color w:val="666666"/>
+        </w:rPr>
+        <w:br/>
+        <w:t>6553 79th Pl, Middle Village</w:t>
+      </w:r>
+      <w:r>
+        <w:rPr>
+          <w:color w:val="666666"/>
+        </w:rPr>
+        <w:br/>
+        <w:t>NY 11379-2720</w:t>
+      </w:r>
+    </w:p>
+    <w:p>
+      <w:pPr>
+        <w:spacing w:after="100"/>
+        <w:rPr>
+          <w:color w:val="666666"/>
+        </w:rPr>
+      </w:pPr>
+    </w:p>
+    <w:p>
+      <w:pPr>
+        <w:spacing w:after="100"/>
+      </w:pPr>
+      <w:r>
+        <w:rPr>
+          <w:color w:val="1A1A1A"/>
+        </w:rPr>
+        <w:t>2. CHANGE ORDERS</w:t>
+      </w:r>
     </w:p>
     <w:p>
       <w:pPr>
         <w:spacing w:before="100" w:after="100"/>
+        <w:rPr>
+          <w:color w:val="666666"/>
+        </w:rPr>
+      </w:pPr>
+      <w:r>
+        <w:rPr>
+          <w:color w:val="666666"/>
+        </w:rPr>
+        <w:t xml:space="preserve">Any changes to the original scope of work must be </w:t>
+      </w:r>
+      <w:r>
+        <w:rPr>
+          <w:color w:val="666666"/>
+        </w:rPr>
+        <w:t>documented and approved by both parties</w:t>
+      </w:r>
+      <w:r>
+        <w:rPr>
+          <w:color w:val="666666"/>
+        </w:rPr>
+        <w:t xml:space="preserve">. Additional costs resulting from changes will be billed accordingly. </w:t>
+      </w:r>
+    </w:p>
+    <w:p>
+      <w:pPr>
+        <w:spacing w:before="100" w:after="100"/>
+      </w:pPr>
+    </w:p>
+    <w:p>
+      <w:pPr>
+        <w:spacing w:before="100" w:after="100"/>
       </w:pPr>
       <w:r>
         <w:rPr>
           <w:color w:val="1A1A1A"/>
         </w:rPr>
-        <w:t>2. CHANGE ORDERS</w:t>
+        <w:t>3. MATERIALS</w:t>
       </w:r>
     </w:p>
     <w:p>
@@ -1865,19 +1979,37 @@
         <w:rPr>
           <w:color w:val="666666"/>
         </w:rPr>
-        <w:t xml:space="preserve">Any changes to the original scope of work must be </w:t>
-      </w:r>
-      <w:r>
+        <w:t>All materials provided by KG Construction Corp are subject to availability. Substitutions of equal or greater quality may be made at the contractor's discretion with client notification.</w:t>
+      </w:r>
+    </w:p>
+    <w:p>
+      <w:pPr>
+        <w:spacing w:before="100" w:after="100"/>
+      </w:pPr>
+    </w:p>
+    <w:p>
+      <w:pPr>
+        <w:spacing w:before="100" w:after="100"/>
+      </w:pPr>
+      <w:r>
+        <w:rPr>
+          <w:color w:val="1A1A1A"/>
+        </w:rPr>
+        <w:t>4. LIABILITY</w:t>
+      </w:r>
+    </w:p>
+    <w:p>
+      <w:pPr>
+        <w:spacing w:before="100" w:after="100"/>
         <w:rPr>
           <w:color w:val="666666"/>
         </w:rPr>
-        <w:t>documented and approved by both parties</w:t>
-      </w:r>
+      </w:pPr>
       <w:r>
         <w:rPr>
           <w:color w:val="666666"/>
         </w:rPr>
-        <w:t xml:space="preserve">. Additional costs resulting from changes will be billed accordingly. </w:t>
+        <w:t>KG Construction Corp maintains general liability insurance. The contractor shall not be liable for delays caused by weather, material shortages, or other conditions beyond reasonable control.</w:t>
       </w:r>
     </w:p>
     <w:p>
@@ -1893,7 +2025,7 @@
         <w:rPr>
           <w:color w:val="1A1A1A"/>
         </w:rPr>
-        <w:t>3. MATERIALS</w:t>
+        <w:t>5. ACCEPTANCE</w:t>
       </w:r>
     </w:p>
     <w:p>
@@ -1907,23 +2039,29 @@
         <w:rPr>
           <w:color w:val="666666"/>
         </w:rPr>
-        <w:t>All materials provided by KG Construction Corp are subject to availability. Substitutions of equal or greater quality may be made at the contractor's discretion with client notification.</w:t>
+        <w:t>This proposal is valid for 30 days from the date of issue. Accepting constitutes agreement to terms and conditions outlined in this document.</w:t>
       </w:r>
     </w:p>
     <w:p>
       <w:pPr>
         <w:spacing w:before="100" w:after="100"/>
+        <w:rPr>
+          <w:color w:val="1A1A1A"/>
+        </w:rPr>
       </w:pPr>
     </w:p>
     <w:p>
       <w:pPr>
         <w:spacing w:before="100" w:after="100"/>
+        <w:rPr>
+          <w:color w:val="666666"/>
+        </w:rPr>
       </w:pPr>
       <w:r>
         <w:rPr>
           <w:color w:val="1A1A1A"/>
         </w:rPr>
-        <w:t>4. LIABILITY</w:t>
+        <w:t xml:space="preserve">6. SITE ACCESS </w:t>
       </w:r>
     </w:p>
     <w:p>
@@ -1937,23 +2075,29 @@
         <w:rPr>
           <w:color w:val="666666"/>
         </w:rPr>
-        <w:t>KG Construction Corp maintains general liability insurance. The contractor shall not be liable for delays caused by weather, material shortages, or other conditions beyond reasonable control.</w:t>
+        <w:t>The client agrees to provide reasonable access to the property during normal working hours for the duration of the project. Delays caused by restricted access, scheduling conflicts, or inability to access the work area may result in schedule adjustments and additional costs.</w:t>
       </w:r>
     </w:p>
     <w:p>
       <w:pPr>
         <w:spacing w:before="100" w:after="100"/>
+        <w:rPr>
+          <w:color w:val="666666"/>
+        </w:rPr>
       </w:pPr>
     </w:p>
     <w:p>
       <w:pPr>
         <w:spacing w:before="100" w:after="100"/>
+        <w:rPr>
+          <w:color w:val="666666"/>
+        </w:rPr>
       </w:pPr>
       <w:r>
         <w:rPr>
           <w:color w:val="1A1A1A"/>
         </w:rPr>
-        <w:t>5. ACCEPTANCE</w:t>
+        <w:t>7. PAYMENET DELAYS</w:t>
       </w:r>
     </w:p>
     <w:p>
@@ -1967,16 +2111,36 @@
         <w:rPr>
           <w:color w:val="666666"/>
         </w:rPr>
-        <w:t>This proposal is valid for 30 days from the date of issue. Accepting constitutes agreement to terms and conditions outlined in this document.</w:t>
+        <w:t xml:space="preserve">Payments not received within the agreed payment terms shall accrue interest at a rate of 1.5% per month (18% annually) on the unpaid balance, or the maximum rate permitted under New York law. Interest will begin accruing immediately after the payment due date and will continue until the balance is paid in full. </w:t>
       </w:r>
     </w:p>
     <w:p>
       <w:pPr>
         <w:spacing w:before="100" w:after="100"/>
         <w:rPr>
+          <w:color w:val="666666"/>
+        </w:rPr>
+      </w:pPr>
+    </w:p>
+    <w:p>
+      <w:pPr>
+        <w:spacing w:before="100" w:after="100"/>
+        <w:rPr>
           <w:color w:val="1A1A1A"/>
         </w:rPr>
       </w:pPr>
+      <w:r>
+        <w:rPr>
+          <w:color w:val="1A1A1A"/>
+        </w:rPr>
+        <w:t xml:space="preserve">8. </w:t>
+      </w:r>
+      <w:r>
+        <w:rPr>
+          <w:color w:val="1A1A1A"/>
+        </w:rPr>
+        <w:t>PERMITS AND CODE COMPLIANCE</w:t>
+      </w:r>
     </w:p>
     <w:p>
       <w:pPr>
@@ -1987,161 +2151,15 @@
       </w:pPr>
       <w:r>
         <w:rPr>
-          <w:color w:val="1A1A1A"/>
-        </w:rPr>
-        <w:t xml:space="preserve">6. SITE ACCESS </w:t>
-      </w:r>
-    </w:p>
-    <w:p>
-      <w:pPr>
-        <w:spacing w:before="100" w:after="100"/>
-        <w:rPr>
           <w:color w:val="666666"/>
         </w:rPr>
-      </w:pPr>
+        <w:t>KG Construction Corp will perform work in accordance with applicable local building codes and regulations. Responsibility for obtaining permits may rest with the contractor or client depending on the scope, and any permit-related fees or required inspections will be billed accordingly.</w:t>
+      </w:r>
       <w:r>
         <w:rPr>
           <w:color w:val="666666"/>
         </w:rPr>
-        <w:t>The client agrees to provide reasonable access to the property during normal working hours for the duration of the project. Delays caused by restricted access, scheduling conflicts, or inability to access the work area may result in schedule adjustments and additional costs.</w:t>
-      </w:r>
-    </w:p>
-    <w:p>
-      <w:pPr>
-        <w:spacing w:before="100" w:after="100"/>
-        <w:rPr>
-          <w:color w:val="666666"/>
-        </w:rPr>
-      </w:pPr>
-    </w:p>
-    <w:p>
-      <w:pPr>
-        <w:spacing w:before="100" w:after="100"/>
-        <w:rPr>
-          <w:color w:val="666666"/>
-        </w:rPr>
-      </w:pPr>
-      <w:r>
-        <w:rPr>
-          <w:color w:val="1A1A1A"/>
-        </w:rPr>
-        <w:t>7. P</w:t>
-      </w:r>
-      <w:r>
-        <w:rPr>
-          <w:color w:val="1A1A1A"/>
-        </w:rPr>
-        <w:t>AYMENET DELAYS</w:t>
-      </w:r>
-    </w:p>
-    <w:p>
-      <w:pPr>
-        <w:spacing w:before="100" w:after="100"/>
-        <w:rPr>
-          <w:color w:val="666666"/>
-        </w:rPr>
-      </w:pPr>
-      <w:r>
-        <w:rPr>
-          <w:color w:val="666666"/>
-        </w:rPr>
-        <w:t xml:space="preserve">Payments not received within the agreed payment terms shall accrue interest at a rate of 1.5% per month (18% annually) on the unpaid balance, or the maximum rate permitted under New York law. Interest will begin accruing immediately after the payment due date and will continue until the balance is paid in full. </w:t>
-      </w:r>
-    </w:p>
-    <w:p>
-      <w:pPr>
-        <w:spacing w:before="100" w:after="100"/>
-        <w:rPr>
-          <w:color w:val="666666"/>
-        </w:rPr>
-      </w:pPr>
-    </w:p>
-    <w:p>
-      <w:pPr>
-        <w:spacing w:before="100" w:after="100"/>
-        <w:rPr>
-          <w:color w:val="1A1A1A"/>
-        </w:rPr>
-      </w:pPr>
-      <w:r>
-        <w:rPr>
-          <w:color w:val="1A1A1A"/>
-        </w:rPr>
-        <w:t xml:space="preserve">7. </w:t>
-      </w:r>
-      <w:r>
-        <w:rPr>
-          <w:color w:val="1A1A1A"/>
-        </w:rPr>
-        <w:t>PERMITS AND CODE COMPLIANCE</w:t>
-      </w:r>
-    </w:p>
-    <w:p>
-      <w:pPr>
-        <w:spacing w:before="100" w:after="100"/>
-        <w:rPr>
-          <w:color w:val="666666"/>
-        </w:rPr>
-      </w:pPr>
-      <w:r>
-        <w:rPr>
-          <w:color w:val="666666"/>
-        </w:rPr>
-        <w:t>KG Construction Corp will perform work in accordance with applicable local building codes and regulations. Responsibility for obtaining permits may rest with the contractor or client depending on the agreed scope, and any permit-related fees or required inspections will be billed accordingly.</w:t>
-      </w:r>
-    </w:p>
-    <w:p>
-      <w:pPr>
-        <w:spacing w:before="100" w:after="100"/>
-        <w:rPr>
-          <w:color w:val="666666"/>
-        </w:rPr>
-      </w:pPr>
-    </w:p>
-    <w:p>
-      <w:pPr>
-        <w:spacing w:before="100" w:after="100"/>
-        <w:rPr>
-          <w:color w:val="666666"/>
-        </w:rPr>
-      </w:pPr>
-      <w:r>
-        <w:rPr>
-          <w:color w:val="1A1A1A"/>
-        </w:rPr>
-        <w:t>7. RIGHT TO SUSPEND WORK</w:t>
-      </w:r>
-    </w:p>
-    <w:p>
-      <w:pPr>
-        <w:spacing w:before="100" w:after="100"/>
-        <w:rPr>
-          <w:color w:val="666666"/>
-        </w:rPr>
-      </w:pPr>
-      <w:r>
-        <w:rPr>
-          <w:color w:val="666666"/>
-        </w:rPr>
-        <w:t xml:space="preserve">KG Construction Corp reserves the right to suspend work if </w:t>
-      </w:r>
-      <w:r>
-        <w:rPr>
-          <w:color w:val="666666"/>
-        </w:rPr>
-        <w:t xml:space="preserve">agreed </w:t>
-      </w:r>
-      <w:r>
-        <w:rPr>
-          <w:color w:val="666666"/>
-        </w:rPr>
-        <w:t>payments are overdue</w:t>
-      </w:r>
-      <w:r>
-        <w:rPr>
-          <w:color w:val="666666"/>
-        </w:rPr>
-        <w:t>.</w:t>
+        <w:t xml:space="preserve"> KG Construction Corp reserves the right to suspend work if agreed payments are overdue. </w:t>
       </w:r>
     </w:p>
     <w:sectPr>

</xml_diff>

<commit_message>
Specify check as payment method in estimate template terms
Co-Authored-By: Claude Opus 4.6 <noreply@anthropic.com>
</commit_message>
<xml_diff>
--- a/Estimate Template.docx
+++ b/Estimate Template.docx
@@ -583,15 +583,7 @@
                 <w:b/>
                 <w:bCs/>
               </w:rPr>
-              <w:t xml:space="preserve">Project </w:t>
-            </w:r>
-            <w:proofErr w:type="gramStart"/>
-            <w:r>
-              <w:rPr>
-                <w:b/>
-                <w:bCs/>
-              </w:rPr>
-              <w:t xml:space="preserve">Name: </w:t>
+              <w:t xml:space="preserve">Project Name: </w:t>
             </w:r>
             <w:r>
               <w:rPr>
@@ -608,7 +600,6 @@
               <w:t>{</w:t>
             </w:r>
             <w:proofErr w:type="spellStart"/>
-            <w:proofErr w:type="gramEnd"/>
             <w:r>
               <w:rPr>
                 <w:b/>
@@ -690,16 +681,11 @@
         <w:t>#sections</w:t>
       </w:r>
       <w:r>
-        <w:t xml:space="preserve"> in </w:t>
-      </w:r>
-      <w:proofErr w:type="gramStart"/>
-      <w:r>
-        <w:t>sections %</w:t>
+        <w:t xml:space="preserve"> in sections %</w:t>
       </w:r>
       <w:r>
         <w:t>}</w:t>
       </w:r>
-      <w:proofErr w:type="gramEnd"/>
     </w:p>
     <w:tbl>
       <w:tblPr>
@@ -826,7 +812,6 @@
               <w:t>{{</w:t>
             </w:r>
             <w:proofErr w:type="spellStart"/>
-            <w:proofErr w:type="gramStart"/>
             <w:r>
               <w:rPr>
                 <w:b/>
@@ -848,7 +833,6 @@
               <w:t>title</w:t>
             </w:r>
             <w:proofErr w:type="spellEnd"/>
-            <w:proofErr w:type="gramEnd"/>
             <w:r>
               <w:rPr>
                 <w:b/>
@@ -911,7 +895,6 @@
               <w:t>{{</w:t>
             </w:r>
             <w:proofErr w:type="spellStart"/>
-            <w:proofErr w:type="gramStart"/>
             <w:r>
               <w:rPr>
                 <w:b/>
@@ -933,7 +916,6 @@
               <w:t>price</w:t>
             </w:r>
             <w:proofErr w:type="spellEnd"/>
-            <w:proofErr w:type="gramEnd"/>
             <w:r>
               <w:rPr>
                 <w:b/>
@@ -980,7 +962,6 @@
         <w:t xml:space="preserve">% for line in </w:t>
       </w:r>
       <w:proofErr w:type="spellStart"/>
-      <w:proofErr w:type="gramStart"/>
       <w:r>
         <w:rPr>
           <w:color w:val="4A4A4A"/>
@@ -998,7 +979,6 @@
         <w:t>lines</w:t>
       </w:r>
       <w:proofErr w:type="spellEnd"/>
-      <w:proofErr w:type="gramEnd"/>
       <w:r>
         <w:rPr>
           <w:color w:val="4A4A4A"/>
@@ -1043,7 +1023,6 @@
         <w:t>{</w:t>
       </w:r>
       <w:proofErr w:type="spellStart"/>
-      <w:proofErr w:type="gramStart"/>
       <w:r>
         <w:rPr>
           <w:color w:val="4A4A4A"/>
@@ -1053,7 +1032,6 @@
         <w:t>line.lineNum</w:t>
       </w:r>
       <w:proofErr w:type="spellEnd"/>
-      <w:proofErr w:type="gramEnd"/>
       <w:r>
         <w:rPr>
           <w:color w:val="4A4A4A"/>
@@ -1155,16 +1133,15 @@
           <w:sz w:val="21"/>
           <w:szCs w:val="21"/>
         </w:rPr>
-        <w:t xml:space="preserve"> </w:t>
-      </w:r>
-      <w:proofErr w:type="gramStart"/>
+        <w:t xml:space="preserve"> %</w:t>
+      </w:r>
       <w:r>
         <w:rPr>
           <w:color w:val="4A4A4A"/>
           <w:sz w:val="21"/>
           <w:szCs w:val="21"/>
         </w:rPr>
-        <w:t>%</w:t>
+        <w:t xml:space="preserve"> </w:t>
       </w:r>
       <w:r>
         <w:rPr>
@@ -1172,17 +1149,19 @@
           <w:sz w:val="21"/>
           <w:szCs w:val="21"/>
         </w:rPr>
-        <w:t xml:space="preserve"> </w:t>
-      </w:r>
-      <w:r>
+        <w:t>}</w:t>
+      </w:r>
+    </w:p>
+    <w:p>
+      <w:pPr>
+        <w:spacing w:before="60" w:after="60"/>
+        <w:ind w:left="400"/>
         <w:rPr>
           <w:color w:val="4A4A4A"/>
           <w:sz w:val="21"/>
           <w:szCs w:val="21"/>
         </w:rPr>
-        <w:t>}</w:t>
-      </w:r>
-      <w:proofErr w:type="gramEnd"/>
+      </w:pPr>
     </w:p>
     <w:p>
       <w:pPr>
@@ -1205,70 +1184,49 @@
           <w:szCs w:val="21"/>
         </w:rPr>
       </w:pPr>
-    </w:p>
-    <w:p>
-      <w:pPr>
-        <w:spacing w:before="60" w:after="60"/>
-        <w:ind w:left="400"/>
+      <w:r>
         <w:rPr>
           <w:color w:val="4A4A4A"/>
           <w:sz w:val="21"/>
           <w:szCs w:val="21"/>
         </w:rPr>
-      </w:pPr>
+        <w:lastRenderedPageBreak/>
+        <w:t>{</w:t>
+      </w:r>
       <w:r>
         <w:rPr>
           <w:color w:val="4A4A4A"/>
           <w:sz w:val="21"/>
           <w:szCs w:val="21"/>
         </w:rPr>
-        <w:lastRenderedPageBreak/>
-        <w:t>{</w:t>
-      </w:r>
+        <w:t xml:space="preserve">% </w:t>
+      </w:r>
+      <w:proofErr w:type="spellStart"/>
       <w:r>
         <w:rPr>
           <w:color w:val="4A4A4A"/>
           <w:sz w:val="21"/>
           <w:szCs w:val="21"/>
         </w:rPr>
-        <w:t xml:space="preserve">% </w:t>
-      </w:r>
-      <w:proofErr w:type="spellStart"/>
+        <w:t>endfor</w:t>
+      </w:r>
+      <w:proofErr w:type="spellEnd"/>
       <w:r>
         <w:rPr>
           <w:color w:val="4A4A4A"/>
           <w:sz w:val="21"/>
           <w:szCs w:val="21"/>
         </w:rPr>
-        <w:t>endfor</w:t>
-      </w:r>
-      <w:proofErr w:type="spellEnd"/>
+        <w:t xml:space="preserve"> %</w:t>
+      </w:r>
       <w:r>
         <w:rPr>
           <w:color w:val="4A4A4A"/>
           <w:sz w:val="21"/>
           <w:szCs w:val="21"/>
         </w:rPr>
-        <w:t xml:space="preserve"> </w:t>
-      </w:r>
-      <w:proofErr w:type="gramStart"/>
-      <w:r>
-        <w:rPr>
-          <w:color w:val="4A4A4A"/>
-          <w:sz w:val="21"/>
-          <w:szCs w:val="21"/>
-        </w:rPr>
-        <w:t>%</w:t>
-      </w:r>
-      <w:r>
-        <w:rPr>
-          <w:color w:val="4A4A4A"/>
-          <w:sz w:val="21"/>
-          <w:szCs w:val="21"/>
-        </w:rPr>
         <w:t xml:space="preserve"> }</w:t>
       </w:r>
-      <w:proofErr w:type="gramEnd"/>
     </w:p>
     <w:tbl>
       <w:tblPr>
@@ -1876,7 +1834,31 @@
         <w:rPr>
           <w:color w:val="666666"/>
         </w:rPr>
-        <w:t xml:space="preserve">Unless otherwise agreed all payments should be made to address below: </w:t>
+        <w:t xml:space="preserve">Unless otherwise agreed all payments should be made </w:t>
+      </w:r>
+      <w:r>
+        <w:rPr>
+          <w:color w:val="666666"/>
+        </w:rPr>
+        <w:t xml:space="preserve">by CHECK </w:t>
+      </w:r>
+      <w:r>
+        <w:rPr>
+          <w:color w:val="666666"/>
+        </w:rPr>
+        <w:t xml:space="preserve">to </w:t>
+      </w:r>
+      <w:r>
+        <w:rPr>
+          <w:color w:val="666666"/>
+        </w:rPr>
+        <w:t xml:space="preserve">the </w:t>
+      </w:r>
+      <w:r>
+        <w:rPr>
+          <w:color w:val="666666"/>
+        </w:rPr>
+        <w:t xml:space="preserve">address below: </w:t>
       </w:r>
     </w:p>
     <w:p>

</xml_diff>